<commit_message>
Add starter files for the Part 1 project book
Every activity in the C++ Foundations Project Book now has a starter file
in project-book/ (one folder per chapter, plus extended-capstone/). Each
starter compiles and runs as-is, repeats the chapter's 'Use only' line,
and gives includes, struct/function/class outlines and numbered TODOs
that follow the book's requirements. No solutions are included.

- project-book/README.md explains how to use, compile and commit them
- Markdown templates for the Module 0 notes, the Module 1 error table and
  the capstone reflection
- The book names each activity's starter file, and activities that asked
  students to create files that now exist have been reworded
- .gitignore keeps compiled binaries in project-book/ out of Git
- README points Part 1 students to the book and the starters

Co-Authored-By: Claude Opus 5.5 <noreply@anthropic.com>
Claude-Session: https://claude.ai/code/session_017h9mh2FD44Gb7mjpUK8s1w
</commit_message>
<xml_diff>
--- a/Teaching Manuals/student-project-book/Foundations-CPP-Student-Project-Book.docx
+++ b/Teaching Manuals/student-project-book/Foundations-CPP-Student-Project-Book.docx
@@ -91,7 +91,7 @@
         <w:spacing w:after="150" w:line="276"/>
       </w:pPr>
       <w:r>
-        <w:t xml:space="preserve">This book is a companion to Part 1 of the Introduction to C++ Programming course (Modules 0-8). It does not re-teach the lessons — read each module's README, work through its examples, and complete its own exercise and project first. What follows here are extra, independent activities for each topic: more practice, applied to new situations, with no starter code and no solutions provided.</w:t>
+        <w:t xml:space="preserve">This book is a companion to Part 1 of the Introduction to C++ Programming course (Modules 0-8). It does not re-teach the lessons — read each module's README, work through its examples, and complete its own exercise and project first. What follows here are extra, independent activities for each topic: more practice, applied to new situations. Every activity has a starter file to begin in, but no solutions are provided.</w:t>
       </w:r>
     </w:p>
     <w:p>
@@ -108,6 +108,14 @@
       </w:pPr>
       <w:r>
         <w:t xml:space="preserve">Each chapter offers three activities of increasing difficulty — FOUNDATIONAL, CORE and CHALLENGE. FOUNDATIONAL checks that you understood the lesson, CORE makes you apply it to a new problem, and CHALLENGE stretches you. You do not have to finish the CHALLENGE before moving on to the next module. Each CHALLENGE includes one hint: read it only after a genuine attempt. Every chapter ends with an optional domain twist that frames the same idea in an Electrical/Electronic Engineering or Biomedical Engineering setting — a preview of the engineering tracks you will meet in Part 2. The final chapter is an Extended Capstone — a bigger, optional challenge that goes beyond Module 9's own capstone.</w:t>
+      </w:r>
+    </w:p>
+    <w:p>
+      <w:pPr>
+        <w:spacing w:after="150" w:line="276"/>
+      </w:pPr>
+      <w:r>
+        <w:t xml:space="preserve">Starter files live in the project-book folder of the course repository, with one folder per chapter (module-00 to module-08, plus extended-capstone), and each activity below names its starter file. A starter gives you the #include lines and — in later chapters — the struct, function and class outlines, with numbered TODO comments that follow the activity's requirements one by one. It compiles and runs as it is, but does nothing useful until you complete it, and it never contains the answer. For a domain twist, copy the starter of the activity you are twisting and adapt it.</w:t>
       </w:r>
     </w:p>
     <w:p>
@@ -229,6 +237,30 @@
     <w:p>
       <w:pPr>
         <w:keepNext/>
+        <w:spacing w:after="120"/>
+      </w:pPr>
+      <w:r>
+        <w:rPr>
+          <w:b/>
+          <w:bCs/>
+          <w:color w:val="44546A"/>
+          <w:sz w:val="18"/>
+          <w:szCs w:val="18"/>
+        </w:rPr>
+        <w:t xml:space="preserve">STARTER FILE: </w:t>
+      </w:r>
+      <w:r>
+        <w:rPr>
+          <w:color w:val="2E75B6"/>
+          <w:sz w:val="18"/>
+          <w:szCs w:val="18"/>
+        </w:rPr>
+        <w:t xml:space="preserve">project-book/module-00/ABOUT-ME.md</w:t>
+      </w:r>
+    </w:p>
+    <w:p>
+      <w:pPr>
+        <w:keepNext/>
         <w:spacing w:after="120" w:line="276"/>
       </w:pPr>
       <w:r>
@@ -273,7 +305,7 @@
         <w:spacing w:after="90" w:line="276"/>
       </w:pPr>
       <w:r>
-        <w:t xml:space="preserve">Inside your course folder, create a folder named project-book, and inside it a folder named module-00.</w:t>
+        <w:t xml:space="preserve">Open the project-book folder in VS Code. It already holds one folder per chapter; your Chapter 0 work goes in module-00.</w:t>
       </w:r>
     </w:p>
     <w:p>
@@ -299,7 +331,7 @@
         <w:spacing w:after="90" w:line="276"/>
       </w:pPr>
       <w:r>
-        <w:t xml:space="preserve">Create a file project-book/README.md in VS Code and write two or three sentences of your own in it: who you are, and what this folder will hold. (A .md file is just plain text.)</w:t>
+        <w:t xml:space="preserve">Open project-book/module-00/ABOUT-ME.md and replace its prompts with two or three sentences of your own: who you are, and what this folder will hold. (A .md file is just plain text.)</w:t>
       </w:r>
     </w:p>
     <w:p>
@@ -359,6 +391,30 @@
     <w:p>
       <w:pPr>
         <w:keepNext/>
+        <w:spacing w:after="120"/>
+      </w:pPr>
+      <w:r>
+        <w:rPr>
+          <w:b/>
+          <w:bCs/>
+          <w:color w:val="44546A"/>
+          <w:sz w:val="18"/>
+          <w:szCs w:val="18"/>
+        </w:rPr>
+        <w:t xml:space="preserve">STARTER FILE: </w:t>
+      </w:r>
+      <w:r>
+        <w:rPr>
+          <w:color w:val="2E75B6"/>
+          <w:sz w:val="18"/>
+          <w:szCs w:val="18"/>
+        </w:rPr>
+        <w:t xml:space="preserve">project-book/module-00/NOTES.md</w:t>
+      </w:r>
+    </w:p>
+    <w:p>
+      <w:pPr>
+        <w:keepNext/>
         <w:spacing w:after="120" w:line="276"/>
       </w:pPr>
       <w:r>
@@ -429,7 +485,7 @@
         <w:spacing w:after="90" w:line="276"/>
       </w:pPr>
       <w:r>
-        <w:t xml:space="preserve">Use git status before every git add, and write down in project-book/module-00/NOTES.md what git status showed you each time (which files were new or modified).</w:t>
+        <w:t xml:space="preserve">Use git status before every git add, and record in the Activity 2 table in project-book/module-00/NOTES.md what git status showed you each time (which files were new or modified).</w:t>
       </w:r>
     </w:p>
     <w:p>
@@ -489,6 +545,30 @@
     <w:p>
       <w:pPr>
         <w:keepNext/>
+        <w:spacing w:after="120"/>
+      </w:pPr>
+      <w:r>
+        <w:rPr>
+          <w:b/>
+          <w:bCs/>
+          <w:color w:val="44546A"/>
+          <w:sz w:val="18"/>
+          <w:szCs w:val="18"/>
+        </w:rPr>
+        <w:t xml:space="preserve">STARTER FILE: </w:t>
+      </w:r>
+      <w:r>
+        <w:rPr>
+          <w:color w:val="2E75B6"/>
+          <w:sz w:val="18"/>
+          <w:szCs w:val="18"/>
+        </w:rPr>
+        <w:t xml:space="preserve">project-book/module-00/NOTES.md</w:t>
+      </w:r>
+    </w:p>
+    <w:p>
+      <w:pPr>
+        <w:keepNext/>
         <w:spacing w:after="120" w:line="276"/>
       </w:pPr>
       <w:r>
@@ -559,7 +639,7 @@
         <w:spacing w:after="90" w:line="276"/>
       </w:pPr>
       <w:r>
-        <w:t xml:space="preserve">In NOTES.md, write a small two-column table matching each terminal command (git status, git add, git commit, git push) to the button or view in VS Code that does the same job.</w:t>
+        <w:t xml:space="preserve">In the Activity 3 table in NOTES.md, match each terminal command (git status, git add, git commit, git push) to the button or view in VS Code that does the same job.</w:t>
       </w:r>
     </w:p>
     <w:p>
@@ -726,6 +806,30 @@
     <w:p>
       <w:pPr>
         <w:keepNext/>
+        <w:spacing w:after="120"/>
+      </w:pPr>
+      <w:r>
+        <w:rPr>
+          <w:b/>
+          <w:bCs/>
+          <w:color w:val="44546A"/>
+          <w:sz w:val="18"/>
+          <w:szCs w:val="18"/>
+        </w:rPr>
+        <w:t xml:space="preserve">STARTER FILE: </w:t>
+      </w:r>
+      <w:r>
+        <w:rPr>
+          <w:color w:val="2E75B6"/>
+          <w:sz w:val="18"/>
+          <w:szCs w:val="18"/>
+        </w:rPr>
+        <w:t xml:space="preserve">project-book/module-01/timetable.cpp</w:t>
+      </w:r>
+    </w:p>
+    <w:p>
+      <w:pPr>
+        <w:keepNext/>
         <w:spacing w:after="120" w:line="276"/>
       </w:pPr>
       <w:r>
@@ -856,6 +960,30 @@
     <w:p>
       <w:pPr>
         <w:keepNext/>
+        <w:spacing w:after="120"/>
+      </w:pPr>
+      <w:r>
+        <w:rPr>
+          <w:b/>
+          <w:bCs/>
+          <w:color w:val="44546A"/>
+          <w:sz w:val="18"/>
+          <w:szCs w:val="18"/>
+        </w:rPr>
+        <w:t xml:space="preserve">STARTER FILE: </w:t>
+      </w:r>
+      <w:r>
+        <w:rPr>
+          <w:color w:val="2E75B6"/>
+          <w:sz w:val="18"/>
+          <w:szCs w:val="18"/>
+        </w:rPr>
+        <w:t xml:space="preserve">project-book/module-01/receipt.cpp</w:t>
+      </w:r>
+    </w:p>
+    <w:p>
+      <w:pPr>
+        <w:keepNext/>
         <w:spacing w:after="120" w:line="276"/>
       </w:pPr>
       <w:r>
@@ -986,6 +1114,30 @@
     <w:p>
       <w:pPr>
         <w:keepNext/>
+        <w:spacing w:after="120"/>
+      </w:pPr>
+      <w:r>
+        <w:rPr>
+          <w:b/>
+          <w:bCs/>
+          <w:color w:val="44546A"/>
+          <w:sz w:val="18"/>
+          <w:szCs w:val="18"/>
+        </w:rPr>
+        <w:t xml:space="preserve">STARTER FILE: </w:t>
+      </w:r>
+      <w:r>
+        <w:rPr>
+          <w:color w:val="2E75B6"/>
+          <w:sz w:val="18"/>
+          <w:szCs w:val="18"/>
+        </w:rPr>
+        <w:t xml:space="preserve">project-book/module-01/ERRORS.md</w:t>
+      </w:r>
+    </w:p>
+    <w:p>
+      <w:pPr>
+        <w:keepNext/>
         <w:spacing w:after="120" w:line="276"/>
       </w:pPr>
       <w:r>
@@ -1056,7 +1208,7 @@
         <w:spacing w:after="90" w:line="276"/>
       </w:pPr>
       <w:r>
-        <w:t xml:space="preserve">Record your findings in project-book/module-01/ERRORS.md: the mistake, the first line of the message, and the line number the compiler reported. Mark every case where the reported line was NOT the line with the mistake.</w:t>
+        <w:t xml:space="preserve">Record your findings in the table in project-book/module-01/ERRORS.md: the mistake, the first line of the message, and the line number the compiler reported. Mark every case where the reported line was NOT the line with the mistake.</w:t>
       </w:r>
     </w:p>
     <w:p>
@@ -1223,6 +1375,30 @@
     <w:p>
       <w:pPr>
         <w:keepNext/>
+        <w:spacing w:after="120"/>
+      </w:pPr>
+      <w:r>
+        <w:rPr>
+          <w:b/>
+          <w:bCs/>
+          <w:color w:val="44546A"/>
+          <w:sz w:val="18"/>
+          <w:szCs w:val="18"/>
+        </w:rPr>
+        <w:t xml:space="preserve">STARTER FILE: </w:t>
+      </w:r>
+      <w:r>
+        <w:rPr>
+          <w:color w:val="2E75B6"/>
+          <w:sz w:val="18"/>
+          <w:szCs w:val="18"/>
+        </w:rPr>
+        <w:t xml:space="preserve">project-book/module-02/pick_the_right_type.cpp</w:t>
+      </w:r>
+    </w:p>
+    <w:p>
+      <w:pPr>
+        <w:keepNext/>
         <w:spacing w:after="120" w:line="276"/>
       </w:pPr>
       <w:r>
@@ -1353,6 +1529,30 @@
     <w:p>
       <w:pPr>
         <w:keepNext/>
+        <w:spacing w:after="120"/>
+      </w:pPr>
+      <w:r>
+        <w:rPr>
+          <w:b/>
+          <w:bCs/>
+          <w:color w:val="44546A"/>
+          <w:sz w:val="18"/>
+          <w:szCs w:val="18"/>
+        </w:rPr>
+        <w:t xml:space="preserve">STARTER FILE: </w:t>
+      </w:r>
+      <w:r>
+        <w:rPr>
+          <w:color w:val="2E75B6"/>
+          <w:sz w:val="18"/>
+          <w:szCs w:val="18"/>
+        </w:rPr>
+        <w:t xml:space="preserve">project-book/module-02/trotro_fares.cpp</w:t>
+      </w:r>
+    </w:p>
+    <w:p>
+      <w:pPr>
+        <w:keepNext/>
         <w:spacing w:after="120" w:line="276"/>
       </w:pPr>
       <w:r>
@@ -1478,6 +1678,30 @@
           <w:szCs w:val="18"/>
         </w:rPr>
         <w:t xml:space="preserve">CHALLENGE</w:t>
+      </w:r>
+    </w:p>
+    <w:p>
+      <w:pPr>
+        <w:keepNext/>
+        <w:spacing w:after="120"/>
+      </w:pPr>
+      <w:r>
+        <w:rPr>
+          <w:b/>
+          <w:bCs/>
+          <w:color w:val="44546A"/>
+          <w:sz w:val="18"/>
+          <w:szCs w:val="18"/>
+        </w:rPr>
+        <w:t xml:space="preserve">STARTER FILE: </w:t>
+      </w:r>
+      <w:r>
+        <w:rPr>
+          <w:color w:val="2E75B6"/>
+          <w:sz w:val="18"/>
+          <w:szCs w:val="18"/>
+        </w:rPr>
+        <w:t xml:space="preserve">project-book/module-02/memory_map.cpp</w:t>
       </w:r>
     </w:p>
     <w:p>
@@ -1720,6 +1944,30 @@
     <w:p>
       <w:pPr>
         <w:keepNext/>
+        <w:spacing w:after="120"/>
+      </w:pPr>
+      <w:r>
+        <w:rPr>
+          <w:b/>
+          <w:bCs/>
+          <w:color w:val="44546A"/>
+          <w:sz w:val="18"/>
+          <w:szCs w:val="18"/>
+        </w:rPr>
+        <w:t xml:space="preserve">STARTER FILE: </w:t>
+      </w:r>
+      <w:r>
+        <w:rPr>
+          <w:color w:val="2E75B6"/>
+          <w:sz w:val="18"/>
+          <w:szCs w:val="18"/>
+        </w:rPr>
+        <w:t xml:space="preserve">project-book/module-03/introduce_yourself.cpp</w:t>
+      </w:r>
+    </w:p>
+    <w:p>
+      <w:pPr>
+        <w:keepNext/>
         <w:spacing w:after="120" w:line="276"/>
       </w:pPr>
       <w:r>
@@ -1850,6 +2098,30 @@
     <w:p>
       <w:pPr>
         <w:keepNext/>
+        <w:spacing w:after="120"/>
+      </w:pPr>
+      <w:r>
+        <w:rPr>
+          <w:b/>
+          <w:bCs/>
+          <w:color w:val="44546A"/>
+          <w:sz w:val="18"/>
+          <w:szCs w:val="18"/>
+        </w:rPr>
+        <w:t xml:space="preserve">STARTER FILE: </w:t>
+      </w:r>
+      <w:r>
+        <w:rPr>
+          <w:color w:val="2E75B6"/>
+          <w:sz w:val="18"/>
+          <w:szCs w:val="18"/>
+        </w:rPr>
+        <w:t xml:space="preserve">project-book/module-03/momo_wallet.cpp</w:t>
+      </w:r>
+    </w:p>
+    <w:p>
+      <w:pPr>
+        <w:keepNext/>
         <w:spacing w:after="120" w:line="276"/>
       </w:pPr>
       <w:r>
@@ -1940,7 +2212,6 @@
       <w:pPr>
         <w:pStyle w:val="Heading2"/>
         <w:keepNext/>
-        <w:pageBreakBefore/>
         <w:spacing w:after="120" w:before="240"/>
       </w:pPr>
       <w:r>
@@ -1976,6 +2247,30 @@
           <w:szCs w:val="18"/>
         </w:rPr>
         <w:t xml:space="preserve">CHALLENGE</w:t>
+      </w:r>
+    </w:p>
+    <w:p>
+      <w:pPr>
+        <w:keepNext/>
+        <w:spacing w:after="120"/>
+      </w:pPr>
+      <w:r>
+        <w:rPr>
+          <w:b/>
+          <w:bCs/>
+          <w:color w:val="44546A"/>
+          <w:sz w:val="18"/>
+          <w:szCs w:val="18"/>
+        </w:rPr>
+        <w:t xml:space="preserve">STARTER FILE: </w:t>
+      </w:r>
+      <w:r>
+        <w:rPr>
+          <w:color w:val="2E75B6"/>
+          <w:sz w:val="18"/>
+          <w:szCs w:val="18"/>
+        </w:rPr>
+        <w:t xml:space="preserve">project-book/module-03/scope_detective.cpp</w:t>
       </w:r>
     </w:p>
     <w:p>
@@ -2218,6 +2513,30 @@
     <w:p>
       <w:pPr>
         <w:keepNext/>
+        <w:spacing w:after="120"/>
+      </w:pPr>
+      <w:r>
+        <w:rPr>
+          <w:b/>
+          <w:bCs/>
+          <w:color w:val="44546A"/>
+          <w:sz w:val="18"/>
+          <w:szCs w:val="18"/>
+        </w:rPr>
+        <w:t xml:space="preserve">STARTER FILE: </w:t>
+      </w:r>
+      <w:r>
+        <w:rPr>
+          <w:color w:val="2E75B6"/>
+          <w:sz w:val="18"/>
+          <w:szCs w:val="18"/>
+        </w:rPr>
+        <w:t xml:space="preserve">project-book/module-04/grade_checker.cpp</w:t>
+      </w:r>
+    </w:p>
+    <w:p>
+      <w:pPr>
+        <w:keepNext/>
         <w:spacing w:after="120" w:line="276"/>
       </w:pPr>
       <w:r>
@@ -2348,6 +2667,30 @@
     <w:p>
       <w:pPr>
         <w:keepNext/>
+        <w:spacing w:after="120"/>
+      </w:pPr>
+      <w:r>
+        <w:rPr>
+          <w:b/>
+          <w:bCs/>
+          <w:color w:val="44546A"/>
+          <w:sz w:val="18"/>
+          <w:szCs w:val="18"/>
+        </w:rPr>
+        <w:t xml:space="preserve">STARTER FILE: </w:t>
+      </w:r>
+      <w:r>
+        <w:rPr>
+          <w:color w:val="2E75B6"/>
+          <w:sz w:val="18"/>
+          <w:szCs w:val="18"/>
+        </w:rPr>
+        <w:t xml:space="preserve">project-book/module-04/times_table_trainer.cpp</w:t>
+      </w:r>
+    </w:p>
+    <w:p>
+      <w:pPr>
+        <w:keepNext/>
         <w:spacing w:after="120" w:line="276"/>
       </w:pPr>
       <w:r>
@@ -2473,6 +2816,30 @@
           <w:szCs w:val="18"/>
         </w:rPr>
         <w:t xml:space="preserve">CHALLENGE</w:t>
+      </w:r>
+    </w:p>
+    <w:p>
+      <w:pPr>
+        <w:keepNext/>
+        <w:spacing w:after="120"/>
+      </w:pPr>
+      <w:r>
+        <w:rPr>
+          <w:b/>
+          <w:bCs/>
+          <w:color w:val="44546A"/>
+          <w:sz w:val="18"/>
+          <w:szCs w:val="18"/>
+        </w:rPr>
+        <w:t xml:space="preserve">STARTER FILE: </w:t>
+      </w:r>
+      <w:r>
+        <w:rPr>
+          <w:color w:val="2E75B6"/>
+          <w:sz w:val="18"/>
+          <w:szCs w:val="18"/>
+        </w:rPr>
+        <w:t xml:space="preserve">project-book/module-04/pattern_printer.cpp</w:t>
       </w:r>
     </w:p>
     <w:p>
@@ -2715,6 +3082,30 @@
     <w:p>
       <w:pPr>
         <w:keepNext/>
+        <w:spacing w:after="120"/>
+      </w:pPr>
+      <w:r>
+        <w:rPr>
+          <w:b/>
+          <w:bCs/>
+          <w:color w:val="44546A"/>
+          <w:sz w:val="18"/>
+          <w:szCs w:val="18"/>
+        </w:rPr>
+        <w:t xml:space="preserve">STARTER FILE: </w:t>
+      </w:r>
+      <w:r>
+        <w:rPr>
+          <w:color w:val="2E75B6"/>
+          <w:sz w:val="18"/>
+          <w:szCs w:val="18"/>
+        </w:rPr>
+        <w:t xml:space="preserve">project-book/module-05/weekly_rainfall.cpp</w:t>
+      </w:r>
+    </w:p>
+    <w:p>
+      <w:pPr>
+        <w:keepNext/>
         <w:spacing w:after="120" w:line="276"/>
       </w:pPr>
       <w:r>
@@ -2845,6 +3236,30 @@
     <w:p>
       <w:pPr>
         <w:keepNext/>
+        <w:spacing w:after="120"/>
+      </w:pPr>
+      <w:r>
+        <w:rPr>
+          <w:b/>
+          <w:bCs/>
+          <w:color w:val="44546A"/>
+          <w:sz w:val="18"/>
+          <w:szCs w:val="18"/>
+        </w:rPr>
+        <w:t xml:space="preserve">STARTER FILE: </w:t>
+      </w:r>
+      <w:r>
+        <w:rPr>
+          <w:color w:val="2E75B6"/>
+          <w:sz w:val="18"/>
+          <w:szCs w:val="18"/>
+        </w:rPr>
+        <w:t xml:space="preserve">project-book/module-05/word_inspector.cpp</w:t>
+      </w:r>
+    </w:p>
+    <w:p>
+      <w:pPr>
+        <w:keepNext/>
         <w:spacing w:after="120" w:line="276"/>
       </w:pPr>
       <w:r>
@@ -2970,6 +3385,30 @@
           <w:szCs w:val="18"/>
         </w:rPr>
         <w:t xml:space="preserve">CHALLENGE</w:t>
+      </w:r>
+    </w:p>
+    <w:p>
+      <w:pPr>
+        <w:keepNext/>
+        <w:spacing w:after="120"/>
+      </w:pPr>
+      <w:r>
+        <w:rPr>
+          <w:b/>
+          <w:bCs/>
+          <w:color w:val="44546A"/>
+          <w:sz w:val="18"/>
+          <w:szCs w:val="18"/>
+        </w:rPr>
+        <w:t xml:space="preserve">STARTER FILE: </w:t>
+      </w:r>
+      <w:r>
+        <w:rPr>
+          <w:color w:val="2E75B6"/>
+          <w:sz w:val="18"/>
+          <w:szCs w:val="18"/>
+        </w:rPr>
+        <w:t xml:space="preserve">project-book/module-05/canteen_orders.cpp</w:t>
       </w:r>
     </w:p>
     <w:p>
@@ -3212,6 +3651,30 @@
     <w:p>
       <w:pPr>
         <w:keepNext/>
+        <w:spacing w:after="120"/>
+      </w:pPr>
+      <w:r>
+        <w:rPr>
+          <w:b/>
+          <w:bCs/>
+          <w:color w:val="44546A"/>
+          <w:sz w:val="18"/>
+          <w:szCs w:val="18"/>
+        </w:rPr>
+        <w:t xml:space="preserve">STARTER FILE: </w:t>
+      </w:r>
+      <w:r>
+        <w:rPr>
+          <w:color w:val="2E75B6"/>
+          <w:sz w:val="18"/>
+          <w:szCs w:val="18"/>
+        </w:rPr>
+        <w:t xml:space="preserve">project-book/module-06/unit_converter.cpp</w:t>
+      </w:r>
+    </w:p>
+    <w:p>
+      <w:pPr>
+        <w:keepNext/>
         <w:spacing w:after="120" w:line="276"/>
       </w:pPr>
       <w:r>
@@ -3342,6 +3805,30 @@
     <w:p>
       <w:pPr>
         <w:keepNext/>
+        <w:spacing w:after="120"/>
+      </w:pPr>
+      <w:r>
+        <w:rPr>
+          <w:b/>
+          <w:bCs/>
+          <w:color w:val="44546A"/>
+          <w:sz w:val="18"/>
+          <w:szCs w:val="18"/>
+        </w:rPr>
+        <w:t xml:space="preserve">STARTER FILE: </w:t>
+      </w:r>
+      <w:r>
+        <w:rPr>
+          <w:color w:val="2E75B6"/>
+          <w:sz w:val="18"/>
+          <w:szCs w:val="18"/>
+        </w:rPr>
+        <w:t xml:space="preserve">project-book/module-06/menu_calculator.cpp</w:t>
+      </w:r>
+    </w:p>
+    <w:p>
+      <w:pPr>
+        <w:keepNext/>
         <w:spacing w:after="120" w:line="276"/>
       </w:pPr>
       <w:r>
@@ -3432,7 +3919,6 @@
       <w:pPr>
         <w:pStyle w:val="Heading2"/>
         <w:keepNext/>
-        <w:pageBreakBefore/>
         <w:spacing w:after="120" w:before="240"/>
       </w:pPr>
       <w:r>
@@ -3473,6 +3959,30 @@
     <w:p>
       <w:pPr>
         <w:keepNext/>
+        <w:spacing w:after="120"/>
+      </w:pPr>
+      <w:r>
+        <w:rPr>
+          <w:b/>
+          <w:bCs/>
+          <w:color w:val="44546A"/>
+          <w:sz w:val="18"/>
+          <w:szCs w:val="18"/>
+        </w:rPr>
+        <w:t xml:space="preserve">STARTER FILE: </w:t>
+      </w:r>
+      <w:r>
+        <w:rPr>
+          <w:color w:val="2E75B6"/>
+          <w:sz w:val="18"/>
+          <w:szCs w:val="18"/>
+        </w:rPr>
+        <w:t xml:space="preserve">project-book/module-06/grade_tracker_refactor.cpp</w:t>
+      </w:r>
+    </w:p>
+    <w:p>
+      <w:pPr>
+        <w:keepNext/>
         <w:spacing w:after="120" w:line="276"/>
       </w:pPr>
       <w:r>
@@ -3517,20 +4027,20 @@
         <w:spacing w:after="90" w:line="276"/>
       </w:pPr>
       <w:r>
-        <w:t xml:space="preserve">Copy your Module 5 project into project-book/module-06/. Run it and paste its output into a comment at the top of the file — this is the behaviour you must keep.</w:t>
-      </w:r>
-    </w:p>
-    <w:p>
-      <w:pPr>
-        <w:pStyle w:val="ListParagraph"/>
-        <w:numPr>
-          <w:ilvl w:val="0"/>
-          <w:numId w:val="2"/>
-        </w:numPr>
-        <w:spacing w:after="90" w:line="276"/>
-      </w:pPr>
-      <w:r>
-        <w:t xml:space="preserve">Move the work into functions: double average(std::vector&lt;double&gt; scores), double classAverage(std::vector&lt;Student&gt; students), std::string topStudentName(std::vector&lt;Student&gt; students) and void printStudent(Student s).</w:t>
+        <w:t xml:space="preserve">Run your Module 5 project and paste its output into the comment at the top of the starter file — this is the behaviour you must keep.</w:t>
+      </w:r>
+    </w:p>
+    <w:p>
+      <w:pPr>
+        <w:pStyle w:val="ListParagraph"/>
+        <w:numPr>
+          <w:ilvl w:val="0"/>
+          <w:numId w:val="2"/>
+        </w:numPr>
+        <w:spacing w:after="90" w:line="276"/>
+      </w:pPr>
+      <w:r>
+        <w:t xml:space="preserve">Copy your Module 5 code into the starter, moving the work into the functions it outlines: double average(std::vector&lt;double&gt; scores), double classAverage(std::vector&lt;Student&gt; students), std::string topStudentName(std::vector&lt;Student&gt; students) and void printStudent(Student s).</w:t>
       </w:r>
     </w:p>
     <w:p>
@@ -3710,6 +4220,30 @@
     <w:p>
       <w:pPr>
         <w:keepNext/>
+        <w:spacing w:after="120"/>
+      </w:pPr>
+      <w:r>
+        <w:rPr>
+          <w:b/>
+          <w:bCs/>
+          <w:color w:val="44546A"/>
+          <w:sz w:val="18"/>
+          <w:szCs w:val="18"/>
+        </w:rPr>
+        <w:t xml:space="preserve">STARTER FILE: </w:t>
+      </w:r>
+      <w:r>
+        <w:rPr>
+          <w:color w:val="2E75B6"/>
+          <w:sz w:val="18"/>
+          <w:szCs w:val="18"/>
+        </w:rPr>
+        <w:t xml:space="preserve">project-book/module-07/swap_sort_summarise.cpp</w:t>
+      </w:r>
+    </w:p>
+    <w:p>
+      <w:pPr>
+        <w:keepNext/>
         <w:spacing w:after="120" w:line="276"/>
       </w:pPr>
       <w:r>
@@ -3840,6 +4374,30 @@
     <w:p>
       <w:pPr>
         <w:keepNext/>
+        <w:spacing w:after="120"/>
+      </w:pPr>
+      <w:r>
+        <w:rPr>
+          <w:b/>
+          <w:bCs/>
+          <w:color w:val="44546A"/>
+          <w:sz w:val="18"/>
+          <w:szCs w:val="18"/>
+        </w:rPr>
+        <w:t xml:space="preserve">STARTER FILE: </w:t>
+      </w:r>
+      <w:r>
+        <w:rPr>
+          <w:color w:val="2E75B6"/>
+          <w:sz w:val="18"/>
+          <w:szCs w:val="18"/>
+        </w:rPr>
+        <w:t xml:space="preserve">project-book/module-07/printing_helpers.cpp</w:t>
+      </w:r>
+    </w:p>
+    <w:p>
+      <w:pPr>
+        <w:keepNext/>
         <w:spacing w:after="120" w:line="276"/>
       </w:pPr>
       <w:r>
@@ -3930,7 +4488,6 @@
       <w:pPr>
         <w:pStyle w:val="Heading2"/>
         <w:keepNext/>
-        <w:pageBreakBefore/>
         <w:spacing w:after="120" w:before="240"/>
       </w:pPr>
       <w:r>
@@ -3966,6 +4523,30 @@
           <w:szCs w:val="18"/>
         </w:rPr>
         <w:t xml:space="preserve">CHALLENGE</w:t>
+      </w:r>
+    </w:p>
+    <w:p>
+      <w:pPr>
+        <w:keepNext/>
+        <w:spacing w:after="120"/>
+      </w:pPr>
+      <w:r>
+        <w:rPr>
+          <w:b/>
+          <w:bCs/>
+          <w:color w:val="44546A"/>
+          <w:sz w:val="18"/>
+          <w:szCs w:val="18"/>
+        </w:rPr>
+        <w:t xml:space="preserve">STARTER FILE: </w:t>
+      </w:r>
+      <w:r>
+        <w:rPr>
+          <w:color w:val="2E75B6"/>
+          <w:sz w:val="18"/>
+          <w:szCs w:val="18"/>
+        </w:rPr>
+        <w:t xml:space="preserve">project-book/module-07/recursion_lab.cpp</w:t>
       </w:r>
     </w:p>
     <w:p>
@@ -4208,6 +4789,30 @@
     <w:p>
       <w:pPr>
         <w:keepNext/>
+        <w:spacing w:after="120"/>
+      </w:pPr>
+      <w:r>
+        <w:rPr>
+          <w:b/>
+          <w:bCs/>
+          <w:color w:val="44546A"/>
+          <w:sz w:val="18"/>
+          <w:szCs w:val="18"/>
+        </w:rPr>
+        <w:t xml:space="preserve">STARTER FILE: </w:t>
+      </w:r>
+      <w:r>
+        <w:rPr>
+          <w:color w:val="2E75B6"/>
+          <w:sz w:val="18"/>
+          <w:szCs w:val="18"/>
+        </w:rPr>
+        <w:t xml:space="preserve">project-book/module-08/library_book.cpp</w:t>
+      </w:r>
+    </w:p>
+    <w:p>
+      <w:pPr>
+        <w:keepNext/>
         <w:spacing w:after="120" w:line="276"/>
       </w:pPr>
       <w:r>
@@ -4338,6 +4943,30 @@
     <w:p>
       <w:pPr>
         <w:keepNext/>
+        <w:spacing w:after="120"/>
+      </w:pPr>
+      <w:r>
+        <w:rPr>
+          <w:b/>
+          <w:bCs/>
+          <w:color w:val="44546A"/>
+          <w:sz w:val="18"/>
+          <w:szCs w:val="18"/>
+        </w:rPr>
+        <w:t xml:space="preserve">STARTER FILE: </w:t>
+      </w:r>
+      <w:r>
+        <w:rPr>
+          <w:color w:val="2E75B6"/>
+          <w:sz w:val="18"/>
+          <w:szCs w:val="18"/>
+        </w:rPr>
+        <w:t xml:space="preserve">project-book/module-08/phone_battery.cpp</w:t>
+      </w:r>
+    </w:p>
+    <w:p>
+      <w:pPr>
+        <w:keepNext/>
         <w:spacing w:after="120" w:line="276"/>
       </w:pPr>
       <w:r>
@@ -4463,6 +5092,30 @@
           <w:szCs w:val="18"/>
         </w:rPr>
         <w:t xml:space="preserve">CHALLENGE</w:t>
+      </w:r>
+    </w:p>
+    <w:p>
+      <w:pPr>
+        <w:keepNext/>
+        <w:spacing w:after="120"/>
+      </w:pPr>
+      <w:r>
+        <w:rPr>
+          <w:b/>
+          <w:bCs/>
+          <w:color w:val="44546A"/>
+          <w:sz w:val="18"/>
+          <w:szCs w:val="18"/>
+        </w:rPr>
+        <w:t xml:space="preserve">STARTER FILE: </w:t>
+      </w:r>
+      <w:r>
+        <w:rPr>
+          <w:color w:val="2E75B6"/>
+          <w:sz w:val="18"/>
+          <w:szCs w:val="18"/>
+        </w:rPr>
+        <w:t xml:space="preserve">project-book/module-08/football_league.cpp</w:t>
       </w:r>
     </w:p>
     <w:p>
@@ -4639,7 +5292,7 @@
           <w:bCs/>
           <w:color w:val="44546A"/>
         </w:rPr>
-        <w:t xml:space="preserve">Copy your Module 9 capstone into project-book/extended-capstone/ and extend it there. Each numbered section below is one stage: finish it, test it, and commit it before starting the next.</w:t>
+        <w:t xml:space="preserve">Start from the skeleton in project-book/extended-capstone/school_reports.cpp, copying in the working code from your own Module 9 capstone as you go. Each numbered section below is one stage: finish it, test it, and commit it before starting the next.</w:t>
       </w:r>
     </w:p>
     <w:p>
@@ -4754,7 +5407,7 @@
         <w:spacing w:after="150" w:line="276"/>
       </w:pPr>
       <w:r>
-        <w:t xml:space="preserve">Add a REFLECTION.md file to your project answering, in your own words, in 200-400 words in total: Which design decision was hardest — for example, deciding which class should own which data? Which bug took you longest to find, and how did you find it? Which Part 1 module helped you most in this project, and why? If you could add one feature you don't yet know how to build, what would it be?</w:t>
+        <w:t xml:space="preserve">Fill in the REFLECTION.md file in project-book/extended-capstone/, answering in your own words, in 200-400 words in total: Which design decision was hardest — for example, deciding which class should own which data? Which bug took you longest to find, and how did you find it? Which Part 1 module helped you most in this project, and why? If you could add one feature you don't yet know how to build, what would it be?</w:t>
       </w:r>
     </w:p>
     <w:p>

</xml_diff>